<commit_message>
ceci est un test de modif
</commit_message>
<xml_diff>
--- a/V0.docx
+++ b/V0.docx
@@ -168,9 +168,8 @@
       <w:pPr>
         <w:spacing w:after="0" w:line="240" w:lineRule="auto"/>
         <w:rPr>
-          <w:rFonts w:ascii="Times New Roman" w:eastAsia="Times New Roman" w:hAnsi="Times New Roman" w:cs="Times New Roman"/>
-          <w:sz w:val="24"/>
-          <w:szCs w:val="24"/>
+          <w:rFonts w:ascii="Arial" w:eastAsia="Times New Roman" w:hAnsi="Arial" w:cs="Arial"/>
+          <w:color w:val="000000"/>
           <w:lang w:eastAsia="fr-FR"/>
         </w:rPr>
       </w:pPr>
@@ -191,6 +190,30 @@
           <w:lang w:eastAsia="fr-FR"/>
         </w:rPr>
         <w:t>  faire un proto papier qui n’aura pas de format numérique</w:t>
+      </w:r>
+      <w:r>
+        <w:rPr>
+          <w:rFonts w:ascii="Arial" w:eastAsia="Times New Roman" w:hAnsi="Arial" w:cs="Arial"/>
+          <w:color w:val="000000"/>
+          <w:lang w:eastAsia="fr-FR"/>
+        </w:rPr>
+        <w:t xml:space="preserve"> (mdrr</w:t>
+      </w:r>
+      <w:r>
+        <w:rPr>
+          <w:rFonts w:ascii="Arial" w:eastAsia="Times New Roman" w:hAnsi="Arial" w:cs="Arial"/>
+          <w:color w:val="000000"/>
+          <w:lang w:eastAsia="fr-FR"/>
+        </w:rPr>
+        <w:t>rrrrrrr</w:t>
+      </w:r>
+      <w:r>
+        <w:rPr>
+          <w:rFonts w:ascii="Arial" w:eastAsia="Times New Roman" w:hAnsi="Arial" w:cs="Arial"/>
+          <w:color w:val="000000"/>
+          <w:lang w:eastAsia="fr-FR"/>
+        </w:rPr>
+        <w:t>)</w:t>
       </w:r>
     </w:p>
     <w:p>
@@ -322,23 +345,13 @@
           <w:lang w:eastAsia="fr-FR"/>
         </w:rPr>
       </w:pPr>
-      <w:proofErr w:type="gramStart"/>
-      <w:r>
-        <w:rPr>
-          <w:rFonts w:ascii="Arial" w:eastAsia="Times New Roman" w:hAnsi="Arial" w:cs="Arial"/>
-          <w:color w:val="000000"/>
-          <w:lang w:eastAsia="fr-FR"/>
-        </w:rPr>
-        <w:t>nombre</w:t>
-      </w:r>
-      <w:proofErr w:type="gramEnd"/>
-      <w:r>
-        <w:rPr>
-          <w:rFonts w:ascii="Arial" w:eastAsia="Times New Roman" w:hAnsi="Arial" w:cs="Arial"/>
-          <w:color w:val="000000"/>
-          <w:lang w:eastAsia="fr-FR"/>
-        </w:rPr>
-        <w:t xml:space="preserve"> de joueur : création de serveur avec nombre de joueur illimité</w:t>
+      <w:r>
+        <w:rPr>
+          <w:rFonts w:ascii="Arial" w:eastAsia="Times New Roman" w:hAnsi="Arial" w:cs="Arial"/>
+          <w:color w:val="000000"/>
+          <w:lang w:eastAsia="fr-FR"/>
+        </w:rPr>
+        <w:t>nombre de joueur : création de serveur avec nombre de joueur illimité</w:t>
       </w:r>
     </w:p>
     <w:p>
@@ -355,23 +368,13 @@
           <w:lang w:eastAsia="fr-FR"/>
         </w:rPr>
       </w:pPr>
-      <w:proofErr w:type="gramStart"/>
-      <w:r>
-        <w:rPr>
-          <w:rFonts w:ascii="Arial" w:eastAsia="Times New Roman" w:hAnsi="Arial" w:cs="Arial"/>
-          <w:color w:val="000000"/>
-          <w:lang w:eastAsia="fr-FR"/>
-        </w:rPr>
-        <w:t>écoulement</w:t>
-      </w:r>
-      <w:proofErr w:type="gramEnd"/>
-      <w:r>
-        <w:rPr>
-          <w:rFonts w:ascii="Arial" w:eastAsia="Times New Roman" w:hAnsi="Arial" w:cs="Arial"/>
-          <w:color w:val="000000"/>
-          <w:lang w:eastAsia="fr-FR"/>
-        </w:rPr>
-        <w:t xml:space="preserve"> du temps : temps réel </w:t>
+      <w:r>
+        <w:rPr>
+          <w:rFonts w:ascii="Arial" w:eastAsia="Times New Roman" w:hAnsi="Arial" w:cs="Arial"/>
+          <w:color w:val="000000"/>
+          <w:lang w:eastAsia="fr-FR"/>
+        </w:rPr>
+        <w:t>écoulement du temps : temps réel </w:t>
       </w:r>
     </w:p>
     <w:p>
@@ -394,18 +397,8 @@
           <w:color w:val="000000"/>
           <w:lang w:eastAsia="fr-FR"/>
         </w:rPr>
-        <w:t xml:space="preserve">Actions possibles : Action d’observation / Vérification d’hypothèse (une interaction du joueur provoque une interaction spécifique des individus de la civilisation, qui valide l’hypothèse du joueur ou pas. Par exemple un joueur se fait agresser s’il fait trop de bruit dans une civilisation qui repose sur le </w:t>
-      </w:r>
-      <w:proofErr w:type="gramStart"/>
-      <w:r>
-        <w:rPr>
-          <w:rFonts w:ascii="Arial" w:eastAsia="Times New Roman" w:hAnsi="Arial" w:cs="Arial"/>
-          <w:color w:val="000000"/>
-          <w:lang w:eastAsia="fr-FR"/>
-        </w:rPr>
-        <w:t>silence )</w:t>
-      </w:r>
-      <w:proofErr w:type="gramEnd"/>
+        <w:t>Actions possibles : Action d’observation / Vérification d’hypothèse (une interaction du joueur provoque une interaction spécifique des individus de la civilisation, qui valide l’hypothèse du joueur ou pas. Par exemple un joueur se fait agresser s’il fait trop de bruit dans une civilisation qui repose sur le silence )</w:t>
+      </w:r>
     </w:p>
     <w:p>
       <w:pPr>
@@ -427,25 +420,7 @@
           <w:color w:val="000000"/>
           <w:lang w:eastAsia="fr-FR"/>
         </w:rPr>
-        <w:t xml:space="preserve">Rapports &amp; Notes : Tableau de notes </w:t>
-      </w:r>
-      <w:proofErr w:type="gramStart"/>
-      <w:r>
-        <w:rPr>
-          <w:rFonts w:ascii="Arial" w:eastAsia="Times New Roman" w:hAnsi="Arial" w:cs="Arial"/>
-          <w:color w:val="000000"/>
-          <w:lang w:eastAsia="fr-FR"/>
-        </w:rPr>
-        <w:t>( liberté</w:t>
-      </w:r>
-      <w:proofErr w:type="gramEnd"/>
-      <w:r>
-        <w:rPr>
-          <w:rFonts w:ascii="Arial" w:eastAsia="Times New Roman" w:hAnsi="Arial" w:cs="Arial"/>
-          <w:color w:val="000000"/>
-          <w:lang w:eastAsia="fr-FR"/>
-        </w:rPr>
-        <w:t xml:space="preserve"> d’organiser des sections) / Tableau des faits vérifiés (% de complétion )</w:t>
+        <w:t>Rapports &amp; Notes : Tableau de notes ( liberté d’organiser des sections) / Tableau des faits vérifiés (% de complétion )</w:t>
       </w:r>
     </w:p>
     <w:p>
@@ -468,25 +443,7 @@
           <w:color w:val="000000"/>
           <w:lang w:eastAsia="fr-FR"/>
         </w:rPr>
-        <w:t xml:space="preserve">Point de </w:t>
-      </w:r>
-      <w:proofErr w:type="gramStart"/>
-      <w:r>
-        <w:rPr>
-          <w:rFonts w:ascii="Arial" w:eastAsia="Times New Roman" w:hAnsi="Arial" w:cs="Arial"/>
-          <w:color w:val="000000"/>
-          <w:lang w:eastAsia="fr-FR"/>
-        </w:rPr>
-        <w:t>vue  :</w:t>
-      </w:r>
-      <w:proofErr w:type="gramEnd"/>
-      <w:r>
-        <w:rPr>
-          <w:rFonts w:ascii="Arial" w:eastAsia="Times New Roman" w:hAnsi="Arial" w:cs="Arial"/>
-          <w:color w:val="000000"/>
-          <w:lang w:eastAsia="fr-FR"/>
-        </w:rPr>
-        <w:t xml:space="preserve"> Vue tps / Vue Top Down</w:t>
+        <w:t>Point de vue  : Vue tps / Vue Top Down</w:t>
       </w:r>
     </w:p>
     <w:p>
@@ -509,18 +466,8 @@
           <w:color w:val="000000"/>
           <w:lang w:eastAsia="fr-FR"/>
         </w:rPr>
-        <w:t>Le joueur découvre des paramètres de base dès le début de la partie (la découverte de ces paramètres servirait de tuto également</w:t>
-      </w:r>
-      <w:proofErr w:type="gramStart"/>
-      <w:r>
-        <w:rPr>
-          <w:rFonts w:ascii="Arial" w:eastAsia="Times New Roman" w:hAnsi="Arial" w:cs="Arial"/>
-          <w:color w:val="000000"/>
-          <w:lang w:eastAsia="fr-FR"/>
-        </w:rPr>
-        <w:t>):</w:t>
-      </w:r>
-      <w:proofErr w:type="gramEnd"/>
+        <w:t>Le joueur découvre des paramètres de base dès le début de la partie (la découverte de ces paramètres servirait de tuto également):</w:t>
+      </w:r>
     </w:p>
     <w:p>
       <w:pPr>
@@ -536,23 +483,13 @@
           <w:lang w:eastAsia="fr-FR"/>
         </w:rPr>
       </w:pPr>
-      <w:proofErr w:type="gramStart"/>
-      <w:r>
-        <w:rPr>
-          <w:rFonts w:ascii="Arial" w:eastAsia="Times New Roman" w:hAnsi="Arial" w:cs="Arial"/>
-          <w:color w:val="000000"/>
-          <w:lang w:eastAsia="fr-FR"/>
-        </w:rPr>
-        <w:t>écoulement</w:t>
-      </w:r>
-      <w:proofErr w:type="gramEnd"/>
-      <w:r>
-        <w:rPr>
-          <w:rFonts w:ascii="Arial" w:eastAsia="Times New Roman" w:hAnsi="Arial" w:cs="Arial"/>
-          <w:color w:val="000000"/>
-          <w:lang w:eastAsia="fr-FR"/>
-        </w:rPr>
-        <w:t xml:space="preserve"> du temps (cycle de jour si soleil)</w:t>
+      <w:r>
+        <w:rPr>
+          <w:rFonts w:ascii="Arial" w:eastAsia="Times New Roman" w:hAnsi="Arial" w:cs="Arial"/>
+          <w:color w:val="000000"/>
+          <w:lang w:eastAsia="fr-FR"/>
+        </w:rPr>
+        <w:t>écoulement du temps (cycle de jour si soleil)</w:t>
       </w:r>
     </w:p>
     <w:p>
@@ -569,7 +506,6 @@
           <w:lang w:eastAsia="fr-FR"/>
         </w:rPr>
       </w:pPr>
-      <w:proofErr w:type="gramStart"/>
       <w:r>
         <w:rPr>
           <w:rFonts w:ascii="Arial" w:eastAsia="Times New Roman" w:hAnsi="Arial" w:cs="Arial"/>
@@ -578,7 +514,6 @@
         </w:rPr>
         <w:t>gravité</w:t>
       </w:r>
-      <w:proofErr w:type="gramEnd"/>
     </w:p>
     <w:p>
       <w:pPr>
@@ -594,23 +529,13 @@
           <w:lang w:eastAsia="fr-FR"/>
         </w:rPr>
       </w:pPr>
-      <w:proofErr w:type="gramStart"/>
-      <w:r>
-        <w:rPr>
-          <w:rFonts w:ascii="Arial" w:eastAsia="Times New Roman" w:hAnsi="Arial" w:cs="Arial"/>
-          <w:color w:val="000000"/>
-          <w:lang w:eastAsia="fr-FR"/>
-        </w:rPr>
-        <w:t>composition</w:t>
-      </w:r>
-      <w:proofErr w:type="gramEnd"/>
-      <w:r>
-        <w:rPr>
-          <w:rFonts w:ascii="Arial" w:eastAsia="Times New Roman" w:hAnsi="Arial" w:cs="Arial"/>
-          <w:color w:val="000000"/>
-          <w:lang w:eastAsia="fr-FR"/>
-        </w:rPr>
-        <w:t xml:space="preserve"> de l’air</w:t>
+      <w:r>
+        <w:rPr>
+          <w:rFonts w:ascii="Arial" w:eastAsia="Times New Roman" w:hAnsi="Arial" w:cs="Arial"/>
+          <w:color w:val="000000"/>
+          <w:lang w:eastAsia="fr-FR"/>
+        </w:rPr>
+        <w:t>composition de l’air</w:t>
       </w:r>
     </w:p>
     <w:p>
@@ -627,7 +552,6 @@
           <w:lang w:eastAsia="fr-FR"/>
         </w:rPr>
       </w:pPr>
-      <w:proofErr w:type="gramStart"/>
       <w:r>
         <w:rPr>
           <w:rFonts w:ascii="Arial" w:eastAsia="Times New Roman" w:hAnsi="Arial" w:cs="Arial"/>
@@ -636,7 +560,6 @@
         </w:rPr>
         <w:t>climat</w:t>
       </w:r>
-      <w:proofErr w:type="gramEnd"/>
     </w:p>
     <w:p>
       <w:pPr>
@@ -835,43 +758,7 @@
           <w:color w:val="000000"/>
           <w:lang w:eastAsia="fr-FR"/>
         </w:rPr>
-        <w:t xml:space="preserve">Tableau de notes </w:t>
-      </w:r>
-      <w:proofErr w:type="gramStart"/>
-      <w:r>
-        <w:rPr>
-          <w:rFonts w:ascii="Arial" w:eastAsia="Times New Roman" w:hAnsi="Arial" w:cs="Arial"/>
-          <w:color w:val="000000"/>
-          <w:lang w:eastAsia="fr-FR"/>
-        </w:rPr>
-        <w:t>( liberté</w:t>
-      </w:r>
-      <w:proofErr w:type="gramEnd"/>
-      <w:r>
-        <w:rPr>
-          <w:rFonts w:ascii="Arial" w:eastAsia="Times New Roman" w:hAnsi="Arial" w:cs="Arial"/>
-          <w:color w:val="000000"/>
-          <w:lang w:eastAsia="fr-FR"/>
-        </w:rPr>
-        <w:t xml:space="preserve"> d’organiser des sections : exemples comme enregistrements, lexique ,dessins </w:t>
-      </w:r>
-      <w:proofErr w:type="spellStart"/>
-      <w:r>
-        <w:rPr>
-          <w:rFonts w:ascii="Arial" w:eastAsia="Times New Roman" w:hAnsi="Arial" w:cs="Arial"/>
-          <w:color w:val="000000"/>
-          <w:lang w:eastAsia="fr-FR"/>
-        </w:rPr>
-        <w:t>etc</w:t>
-      </w:r>
-      <w:proofErr w:type="spellEnd"/>
-      <w:r>
-        <w:rPr>
-          <w:rFonts w:ascii="Arial" w:eastAsia="Times New Roman" w:hAnsi="Arial" w:cs="Arial"/>
-          <w:color w:val="000000"/>
-          <w:lang w:eastAsia="fr-FR"/>
-        </w:rPr>
-        <w:t xml:space="preserve"> ) / </w:t>
+        <w:t>Tableau de notes ( liberté d’organiser des sections : exemples comme enregistrements, lexique ,dessins etc ) / </w:t>
       </w:r>
     </w:p>
     <w:p>
@@ -894,18 +781,8 @@
           <w:color w:val="000000"/>
           <w:lang w:eastAsia="fr-FR"/>
         </w:rPr>
-        <w:t xml:space="preserve">Tableau des faits vérifiés (% de </w:t>
-      </w:r>
-      <w:proofErr w:type="gramStart"/>
-      <w:r>
-        <w:rPr>
-          <w:rFonts w:ascii="Arial" w:eastAsia="Times New Roman" w:hAnsi="Arial" w:cs="Arial"/>
-          <w:color w:val="000000"/>
-          <w:lang w:eastAsia="fr-FR"/>
-        </w:rPr>
-        <w:t>complétion )</w:t>
-      </w:r>
-      <w:proofErr w:type="gramEnd"/>
+        <w:t>Tableau des faits vérifiés (% de complétion )</w:t>
+      </w:r>
     </w:p>
     <w:p>
       <w:pPr>
@@ -1025,25 +902,7 @@
           <w:color w:val="000000"/>
           <w:lang w:eastAsia="fr-FR"/>
         </w:rPr>
-        <w:t xml:space="preserve">Civilisation basée sur le silence. Elle communique en chuchotant. Elle n’utilise pas des consonnes et des voyelles qui sont bruyantes. Elles transmettent leur émotions via leur </w:t>
-      </w:r>
-      <w:proofErr w:type="gramStart"/>
-      <w:r>
-        <w:rPr>
-          <w:rFonts w:ascii="Arial" w:eastAsia="Times New Roman" w:hAnsi="Arial" w:cs="Arial"/>
-          <w:color w:val="000000"/>
-          <w:lang w:eastAsia="fr-FR"/>
-        </w:rPr>
-        <w:t>gestuelle;</w:t>
-      </w:r>
-      <w:proofErr w:type="gramEnd"/>
-      <w:r>
-        <w:rPr>
-          <w:rFonts w:ascii="Arial" w:eastAsia="Times New Roman" w:hAnsi="Arial" w:cs="Arial"/>
-          <w:color w:val="000000"/>
-          <w:lang w:eastAsia="fr-FR"/>
-        </w:rPr>
-        <w:t xml:space="preserve"> Exemple : elles peuvent utiliser une phrase qui aura des sens différents en fonction de la gestuelle. Elle est également silencieuse car elle respecte la nature mais aussi à cause d’un prédateur qui est </w:t>
+        <w:t xml:space="preserve">Civilisation basée sur le silence. Elle communique en chuchotant. Elle n’utilise pas des consonnes et des voyelles qui sont bruyantes. Elles transmettent leur émotions via leur gestuelle; Exemple : elles peuvent utiliser une phrase qui aura des sens différents en fonction de la gestuelle. Elle est également silencieuse car elle respecte la nature mais aussi à cause d’un prédateur qui est </w:t>
       </w:r>
       <w:r>
         <w:rPr>
@@ -1087,25 +946,7 @@
           <w:color w:val="000000"/>
           <w:lang w:eastAsia="fr-FR"/>
         </w:rPr>
-        <w:t xml:space="preserve">Le joueur incarne un individu de la civilisation qui intègre la ville pour la première fois. Le joueur peut effectuer des </w:t>
-      </w:r>
-      <w:proofErr w:type="gramStart"/>
-      <w:r>
-        <w:rPr>
-          <w:rFonts w:ascii="Arial" w:eastAsia="Times New Roman" w:hAnsi="Arial" w:cs="Arial"/>
-          <w:color w:val="000000"/>
-          <w:lang w:eastAsia="fr-FR"/>
-        </w:rPr>
-        <w:t>actions( parler</w:t>
-      </w:r>
-      <w:proofErr w:type="gramEnd"/>
-      <w:r>
-        <w:rPr>
-          <w:rFonts w:ascii="Arial" w:eastAsia="Times New Roman" w:hAnsi="Arial" w:cs="Arial"/>
-          <w:color w:val="000000"/>
-          <w:lang w:eastAsia="fr-FR"/>
-        </w:rPr>
-        <w:t xml:space="preserve"> , interagir, analyser des échantillons) et capter des informations via sa vision (enregistrement)</w:t>
+        <w:t>Le joueur incarne un individu de la civilisation qui intègre la ville pour la première fois. Le joueur peut effectuer des actions( parler , interagir, analyser des échantillons) et capter des informations via sa vision (enregistrement)</w:t>
       </w:r>
     </w:p>
     <w:p>
@@ -1157,7 +998,6 @@
           <w:lang w:eastAsia="fr-FR"/>
         </w:rPr>
       </w:pPr>
-      <w:proofErr w:type="gramStart"/>
       <w:r>
         <w:rPr>
           <w:rFonts w:ascii="Arial" w:eastAsia="Times New Roman" w:hAnsi="Arial" w:cs="Arial"/>
@@ -1174,16 +1014,7 @@
           <w:color w:val="000000"/>
           <w:lang w:eastAsia="fr-FR"/>
         </w:rPr>
-        <w:t>:</w:t>
-      </w:r>
-      <w:proofErr w:type="gramEnd"/>
-      <w:r>
-        <w:rPr>
-          <w:rFonts w:ascii="Arial" w:eastAsia="Times New Roman" w:hAnsi="Arial" w:cs="Arial"/>
-          <w:color w:val="000000"/>
-          <w:lang w:eastAsia="fr-FR"/>
-        </w:rPr>
-        <w:t xml:space="preserve"> dans une ville (et pas un monde)</w:t>
+        <w:t>: dans une ville (et pas un monde)</w:t>
       </w:r>
     </w:p>
     <w:p>
@@ -1350,25 +1181,7 @@
           <w:color w:val="000000"/>
           <w:lang w:eastAsia="fr-FR"/>
         </w:rPr>
-        <w:t xml:space="preserve"> </w:t>
-      </w:r>
-      <w:proofErr w:type="gramStart"/>
-      <w:r>
-        <w:rPr>
-          <w:rFonts w:ascii="Arial" w:eastAsia="Times New Roman" w:hAnsi="Arial" w:cs="Arial"/>
-          <w:color w:val="000000"/>
-          <w:lang w:eastAsia="fr-FR"/>
-        </w:rPr>
-        <w:t>( qui</w:t>
-      </w:r>
-      <w:proofErr w:type="gramEnd"/>
-      <w:r>
-        <w:rPr>
-          <w:rFonts w:ascii="Arial" w:eastAsia="Times New Roman" w:hAnsi="Arial" w:cs="Arial"/>
-          <w:color w:val="000000"/>
-          <w:lang w:eastAsia="fr-FR"/>
-        </w:rPr>
-        <w:t xml:space="preserve"> se vérifie par une conséquence comportementale et de langage) : </w:t>
+        <w:t xml:space="preserve"> ( qui se vérifie par une conséquence comportementale et de langage) : </w:t>
       </w:r>
     </w:p>
     <w:p>
@@ -1476,25 +1289,7 @@
           <w:color w:val="000000"/>
           <w:lang w:eastAsia="fr-FR"/>
         </w:rPr>
-        <w:t xml:space="preserve"> </w:t>
-      </w:r>
-      <w:proofErr w:type="gramStart"/>
-      <w:r>
-        <w:rPr>
-          <w:rFonts w:ascii="Arial" w:eastAsia="Times New Roman" w:hAnsi="Arial" w:cs="Arial"/>
-          <w:color w:val="000000"/>
-          <w:lang w:eastAsia="fr-FR"/>
-        </w:rPr>
-        <w:t>il  y</w:t>
-      </w:r>
-      <w:proofErr w:type="gramEnd"/>
-      <w:r>
-        <w:rPr>
-          <w:rFonts w:ascii="Arial" w:eastAsia="Times New Roman" w:hAnsi="Arial" w:cs="Arial"/>
-          <w:color w:val="000000"/>
-          <w:lang w:eastAsia="fr-FR"/>
-        </w:rPr>
-        <w:t xml:space="preserve"> a une conséquence directe (bannissement temporaire, feedback comportementale ou linguistique)</w:t>
+        <w:t xml:space="preserve"> il  y a une conséquence directe (bannissement temporaire, feedback comportementale ou linguistique)</w:t>
       </w:r>
     </w:p>
     <w:p>
@@ -1531,43 +1326,7 @@
           <w:color w:val="000000"/>
           <w:lang w:eastAsia="fr-FR"/>
         </w:rPr>
-        <w:t xml:space="preserve"> elle permet l’accès potentiel à une nouvelle zone, accès à des nouvelles </w:t>
-      </w:r>
-      <w:proofErr w:type="gramStart"/>
-      <w:r>
-        <w:rPr>
-          <w:rFonts w:ascii="Arial" w:eastAsia="Times New Roman" w:hAnsi="Arial" w:cs="Arial"/>
-          <w:color w:val="000000"/>
-          <w:lang w:eastAsia="fr-FR"/>
-        </w:rPr>
-        <w:t>( exemple</w:t>
-      </w:r>
-      <w:proofErr w:type="gramEnd"/>
-      <w:r>
-        <w:rPr>
-          <w:rFonts w:ascii="Arial" w:eastAsia="Times New Roman" w:hAnsi="Arial" w:cs="Arial"/>
-          <w:color w:val="000000"/>
-          <w:lang w:eastAsia="fr-FR"/>
-        </w:rPr>
-        <w:t xml:space="preserve"> cérémonie de danse qui donne l’accès à des </w:t>
-      </w:r>
-      <w:proofErr w:type="spellStart"/>
-      <w:r>
-        <w:rPr>
-          <w:rFonts w:ascii="Arial" w:eastAsia="Times New Roman" w:hAnsi="Arial" w:cs="Arial"/>
-          <w:color w:val="000000"/>
-          <w:lang w:eastAsia="fr-FR"/>
-        </w:rPr>
-        <w:t>intéractions</w:t>
-      </w:r>
-      <w:proofErr w:type="spellEnd"/>
-      <w:r>
-        <w:rPr>
-          <w:rFonts w:ascii="Arial" w:eastAsia="Times New Roman" w:hAnsi="Arial" w:cs="Arial"/>
-          <w:color w:val="000000"/>
-          <w:lang w:eastAsia="fr-FR"/>
-        </w:rPr>
-        <w:t xml:space="preserve"> de danse avec la civilisation)</w:t>
+        <w:t xml:space="preserve"> elle permet l’accès potentiel à une nouvelle zone, accès à des nouvelles ( exemple cérémonie de danse qui donne l’accès à des intéractions de danse avec la civilisation)</w:t>
       </w:r>
     </w:p>
     <w:p>
@@ -1612,18 +1371,7 @@
           <w:color w:val="000000"/>
           <w:lang w:eastAsia="fr-FR"/>
         </w:rPr>
-        <w:t xml:space="preserve">Rapports &amp; </w:t>
-      </w:r>
-      <w:proofErr w:type="gramStart"/>
-      <w:r>
-        <w:rPr>
-          <w:rFonts w:ascii="Arial" w:eastAsia="Times New Roman" w:hAnsi="Arial" w:cs="Arial"/>
-          <w:b/>
-          <w:bCs/>
-          <w:color w:val="000000"/>
-          <w:lang w:eastAsia="fr-FR"/>
-        </w:rPr>
-        <w:t>Notes</w:t>
+        <w:t>Rapports &amp; Notes</w:t>
       </w:r>
       <w:r>
         <w:rPr>
@@ -1633,7 +1381,6 @@
         </w:rPr>
         <w:t>:</w:t>
       </w:r>
-      <w:proofErr w:type="gramEnd"/>
     </w:p>
     <w:p>
       <w:pPr>
@@ -1756,9 +1503,28 @@
           <w:u w:val="single"/>
           <w:lang w:eastAsia="fr-FR"/>
         </w:rPr>
-        <w:t xml:space="preserve">-Recherches </w:t>
-      </w:r>
-      <w:proofErr w:type="gramStart"/>
+        <w:t xml:space="preserve">-Recherches biologiques: </w:t>
+      </w:r>
+      <w:r>
+        <w:rPr>
+          <w:rFonts w:ascii="Arial" w:eastAsia="Times New Roman" w:hAnsi="Arial" w:cs="Arial"/>
+          <w:color w:val="000000"/>
+          <w:lang w:eastAsia="fr-FR"/>
+        </w:rPr>
+        <w:t> classification des résultats biologiques</w:t>
+      </w:r>
+    </w:p>
+    <w:p>
+      <w:pPr>
+        <w:spacing w:after="0" w:line="240" w:lineRule="auto"/>
+        <w:ind w:left="720"/>
+        <w:rPr>
+          <w:rFonts w:ascii="Times New Roman" w:eastAsia="Times New Roman" w:hAnsi="Times New Roman" w:cs="Times New Roman"/>
+          <w:sz w:val="24"/>
+          <w:szCs w:val="24"/>
+          <w:lang w:eastAsia="fr-FR"/>
+        </w:rPr>
+      </w:pPr>
       <w:r>
         <w:rPr>
           <w:rFonts w:ascii="Arial" w:eastAsia="Times New Roman" w:hAnsi="Arial" w:cs="Arial"/>
@@ -1766,9 +1532,28 @@
           <w:u w:val="single"/>
           <w:lang w:eastAsia="fr-FR"/>
         </w:rPr>
-        <w:t>biologiques:</w:t>
-      </w:r>
-      <w:proofErr w:type="gramEnd"/>
+        <w:t>-Recherches culinaires:</w:t>
+      </w:r>
+      <w:r>
+        <w:rPr>
+          <w:rFonts w:ascii="Arial" w:eastAsia="Times New Roman" w:hAnsi="Arial" w:cs="Arial"/>
+          <w:color w:val="000000"/>
+          <w:lang w:eastAsia="fr-FR"/>
+        </w:rPr>
+        <w:t xml:space="preserve"> étude de leur cuisines</w:t>
+      </w:r>
+    </w:p>
+    <w:p>
+      <w:pPr>
+        <w:spacing w:after="0" w:line="240" w:lineRule="auto"/>
+        <w:ind w:left="720"/>
+        <w:rPr>
+          <w:rFonts w:ascii="Times New Roman" w:eastAsia="Times New Roman" w:hAnsi="Times New Roman" w:cs="Times New Roman"/>
+          <w:sz w:val="24"/>
+          <w:szCs w:val="24"/>
+          <w:lang w:eastAsia="fr-FR"/>
+        </w:rPr>
+      </w:pPr>
       <w:r>
         <w:rPr>
           <w:rFonts w:ascii="Arial" w:eastAsia="Times New Roman" w:hAnsi="Arial" w:cs="Arial"/>
@@ -1776,88 +1561,8 @@
           <w:u w:val="single"/>
           <w:lang w:eastAsia="fr-FR"/>
         </w:rPr>
-        <w:t xml:space="preserve"> </w:t>
-      </w:r>
-      <w:r>
-        <w:rPr>
-          <w:rFonts w:ascii="Arial" w:eastAsia="Times New Roman" w:hAnsi="Arial" w:cs="Arial"/>
-          <w:color w:val="000000"/>
-          <w:lang w:eastAsia="fr-FR"/>
-        </w:rPr>
-        <w:t> classification des résultats biologiques</w:t>
-      </w:r>
-    </w:p>
-    <w:p>
-      <w:pPr>
-        <w:spacing w:after="0" w:line="240" w:lineRule="auto"/>
-        <w:ind w:left="720"/>
-        <w:rPr>
-          <w:rFonts w:ascii="Times New Roman" w:eastAsia="Times New Roman" w:hAnsi="Times New Roman" w:cs="Times New Roman"/>
-          <w:sz w:val="24"/>
-          <w:szCs w:val="24"/>
-          <w:lang w:eastAsia="fr-FR"/>
-        </w:rPr>
-      </w:pPr>
-      <w:r>
-        <w:rPr>
-          <w:rFonts w:ascii="Arial" w:eastAsia="Times New Roman" w:hAnsi="Arial" w:cs="Arial"/>
-          <w:color w:val="000000"/>
-          <w:u w:val="single"/>
-          <w:lang w:eastAsia="fr-FR"/>
-        </w:rPr>
-        <w:t xml:space="preserve">-Recherches </w:t>
-      </w:r>
-      <w:proofErr w:type="gramStart"/>
-      <w:r>
-        <w:rPr>
-          <w:rFonts w:ascii="Arial" w:eastAsia="Times New Roman" w:hAnsi="Arial" w:cs="Arial"/>
-          <w:color w:val="000000"/>
-          <w:u w:val="single"/>
-          <w:lang w:eastAsia="fr-FR"/>
-        </w:rPr>
-        <w:t>culinaires:</w:t>
-      </w:r>
-      <w:proofErr w:type="gramEnd"/>
-      <w:r>
-        <w:rPr>
-          <w:rFonts w:ascii="Arial" w:eastAsia="Times New Roman" w:hAnsi="Arial" w:cs="Arial"/>
-          <w:color w:val="000000"/>
-          <w:lang w:eastAsia="fr-FR"/>
-        </w:rPr>
-        <w:t xml:space="preserve"> étude de leur cuisines</w:t>
-      </w:r>
-    </w:p>
-    <w:p>
-      <w:pPr>
-        <w:spacing w:after="0" w:line="240" w:lineRule="auto"/>
-        <w:ind w:left="720"/>
-        <w:rPr>
-          <w:rFonts w:ascii="Times New Roman" w:eastAsia="Times New Roman" w:hAnsi="Times New Roman" w:cs="Times New Roman"/>
-          <w:sz w:val="24"/>
-          <w:szCs w:val="24"/>
-          <w:lang w:eastAsia="fr-FR"/>
-        </w:rPr>
-      </w:pPr>
-      <w:r>
-        <w:rPr>
-          <w:rFonts w:ascii="Arial" w:eastAsia="Times New Roman" w:hAnsi="Arial" w:cs="Arial"/>
-          <w:color w:val="000000"/>
-          <w:u w:val="single"/>
-          <w:lang w:eastAsia="fr-FR"/>
-        </w:rPr>
-        <w:t xml:space="preserve">-Recherches </w:t>
-      </w:r>
-      <w:proofErr w:type="gramStart"/>
-      <w:r>
-        <w:rPr>
-          <w:rFonts w:ascii="Arial" w:eastAsia="Times New Roman" w:hAnsi="Arial" w:cs="Arial"/>
-          <w:color w:val="000000"/>
-          <w:u w:val="single"/>
-          <w:lang w:eastAsia="fr-FR"/>
-        </w:rPr>
-        <w:t>technologiques:</w:t>
-      </w:r>
-      <w:proofErr w:type="gramEnd"/>
+        <w:t>-Recherches technologiques:</w:t>
+      </w:r>
       <w:r>
         <w:rPr>
           <w:rFonts w:ascii="Arial" w:eastAsia="Times New Roman" w:hAnsi="Arial" w:cs="Arial"/>
@@ -1971,18 +1676,8 @@
           <w:color w:val="000000"/>
           <w:lang w:eastAsia="fr-FR"/>
         </w:rPr>
-        <w:t xml:space="preserve">-Us et </w:t>
-      </w:r>
-      <w:proofErr w:type="gramStart"/>
-      <w:r>
-        <w:rPr>
-          <w:rFonts w:ascii="Arial" w:eastAsia="Times New Roman" w:hAnsi="Arial" w:cs="Arial"/>
-          <w:color w:val="000000"/>
-          <w:lang w:eastAsia="fr-FR"/>
-        </w:rPr>
-        <w:t>coutumes ,Cérémonies</w:t>
-      </w:r>
-      <w:proofErr w:type="gramEnd"/>
+        <w:t>-Us et coutumes ,Cérémonies</w:t>
+      </w:r>
     </w:p>
     <w:p>
       <w:pPr>
@@ -2959,46 +2654,12 @@
   </w:num>
   <w:num w:numId="3">
     <w:abstractNumId w:val="5"/>
-    <w:lvlOverride w:ilvl="1">
-      <w:lvl w:ilvl="1">
-        <w:numFmt w:val="bullet"/>
-        <w:lvlText w:val=""/>
-        <w:lvlJc w:val="left"/>
-        <w:pPr>
-          <w:tabs>
-            <w:tab w:val="num" w:pos="1440"/>
-          </w:tabs>
-          <w:ind w:left="1440" w:hanging="360"/>
-        </w:pPr>
-        <w:rPr>
-          <w:rFonts w:ascii="Symbol" w:hAnsi="Symbol" w:hint="default"/>
-          <w:sz w:val="20"/>
-        </w:rPr>
-      </w:lvl>
-    </w:lvlOverride>
   </w:num>
   <w:num w:numId="4">
     <w:abstractNumId w:val="3"/>
   </w:num>
   <w:num w:numId="5">
     <w:abstractNumId w:val="3"/>
-    <w:lvlOverride w:ilvl="1">
-      <w:lvl w:ilvl="1">
-        <w:numFmt w:val="bullet"/>
-        <w:lvlText w:val=""/>
-        <w:lvlJc w:val="left"/>
-        <w:pPr>
-          <w:tabs>
-            <w:tab w:val="num" w:pos="1440"/>
-          </w:tabs>
-          <w:ind w:left="1440" w:hanging="360"/>
-        </w:pPr>
-        <w:rPr>
-          <w:rFonts w:ascii="Symbol" w:hAnsi="Symbol" w:hint="default"/>
-          <w:sz w:val="20"/>
-        </w:rPr>
-      </w:lvl>
-    </w:lvlOverride>
   </w:num>
   <w:num w:numId="6">
     <w:abstractNumId w:val="2"/>

</xml_diff>